<commit_message>
Adds conditional source-lists for dcreator
</commit_message>
<xml_diff>
--- a/templates/surgery_sheet/default.docx
+++ b/templates/surgery_sheet/default.docx
@@ -427,15 +427,7 @@
             </w:pPr>
             <w:r>
               <w:rPr/>
-              <w:t>Procedure: {{p in procedure</w:t>
-            </w:r>
-            <w:r>
-              <w:rPr/>
-              <w:t>s</w:t>
-            </w:r>
-            <w:r>
-              <w:rPr/>
-              <w:t>}} {p.name}</w:t>
+              <w:t>Procedure: {{p in procedures}} {p.name}</w:t>
             </w:r>
           </w:p>
         </w:tc>
@@ -460,15 +452,7 @@
             </w:pPr>
             <w:r>
               <w:rPr/>
-              <w:t>Date of procedure: {p.</w:t>
-            </w:r>
-            <w:r>
-              <w:rPr/>
-              <w:t>start_</w:t>
-            </w:r>
-            <w:r>
-              <w:rPr/>
-              <w:t>date}</w:t>
+              <w:t>Date of procedure: {p.start_date}</w:t>
             </w:r>
           </w:p>
         </w:tc>
@@ -588,15 +572,7 @@
             </w:pPr>
             <w:r>
               <w:rPr/>
-              <w:t>Procedure: {{p in post_procedure</w:t>
-            </w:r>
-            <w:r>
-              <w:rPr/>
-              <w:t>s</w:t>
-            </w:r>
-            <w:r>
-              <w:rPr/>
-              <w:t>}} {p.name}</w:t>
+              <w:t>Procedure: {{p in post_procedures}} {p.name}</w:t>
             </w:r>
           </w:p>
         </w:tc>
@@ -622,15 +598,7 @@
             </w:pPr>
             <w:r>
               <w:rPr/>
-              <w:t>Date of procedure: {p.</w:t>
-            </w:r>
-            <w:r>
-              <w:rPr/>
-              <w:t>start_</w:t>
-            </w:r>
-            <w:r>
-              <w:rPr/>
-              <w:t>date}</w:t>
+              <w:t>Date of procedure: {p.start_date}</w:t>
             </w:r>
           </w:p>
         </w:tc>
@@ -1021,7 +989,7 @@
                 <w:sz w:val="24"/>
                 <w:szCs w:val="24"/>
               </w:rPr>
-              <w:t>Date {{date in start-end}} {date}</w:t>
+              <w:t>Date {{drug in analgesic where name==Carprofen}} {drug.date}</w:t>
             </w:r>
           </w:p>
         </w:tc>
@@ -1972,14 +1940,7 @@
           <w:sz w:val="24"/>
           <w:szCs w:val="24"/>
         </w:rPr>
-        <w:t>[signiture</w:t>
-      </w:r>
-      <w:r>
-        <w:rPr>
-          <w:sz w:val="24"/>
-          <w:szCs w:val="24"/>
-        </w:rPr>
-        <w:t>]</w:t>
+        <w:t>[signiture]</w:t>
       </w:r>
     </w:p>
     <w:p>

</xml_diff>

<commit_message>
Working on #30 -
Makes functionality to generating surgery sheet availible again.
</commit_message>
<xml_diff>
--- a/templates/surgery_sheet/default.docx
+++ b/templates/surgery_sheet/default.docx
@@ -765,7 +765,7 @@
                 <w:sz w:val="24"/>
                 <w:szCs w:val="24"/>
               </w:rPr>
-              <w:t>Anesthetic {{drug in anesthetic}} {drug.name}</w:t>
+              <w:t>Anesthetic {{drug in anesthesia}} {drug.name}</w:t>
             </w:r>
           </w:p>
         </w:tc>
@@ -989,7 +989,7 @@
                 <w:sz w:val="24"/>
                 <w:szCs w:val="24"/>
               </w:rPr>
-              <w:t>Date {{drug in analgesic where name==Carprofen}} {drug.date}</w:t>
+              <w:t>Date {{drug in analgesia where name==Carprofen}} {drug.date}</w:t>
             </w:r>
           </w:p>
         </w:tc>
@@ -1184,7 +1184,7 @@
                 <w:sz w:val="24"/>
                 <w:szCs w:val="24"/>
               </w:rPr>
-              <w:t>Analgesic {{drug in analgesic}} {drug.name}</w:t>
+              <w:t>Analgesic {{drug in analgesia}} {drug.name}</w:t>
             </w:r>
           </w:p>
         </w:tc>
@@ -1557,7 +1557,7 @@
                 <w:sz w:val="24"/>
                 <w:szCs w:val="24"/>
               </w:rPr>
-              <w:t>[end]</w:t>
+              <w:t>[death_date]</w:t>
             </w:r>
           </w:p>
         </w:tc>

</xml_diff>

<commit_message>
Fixes #67 and fixes #63 -
Working on modals, increasing there size and using default selecting in select-fields
to make using defaults more easy
</commit_message>
<xml_diff>
--- a/templates/surgery_sheet/default.docx
+++ b/templates/surgery_sheet/default.docx
@@ -1398,7 +1398,23 @@
                 <w:sz w:val="24"/>
                 <w:szCs w:val="24"/>
               </w:rPr>
-              <w:t>Anesthetic</w:t>
+              <w:t xml:space="preserve">Anesthetic {{drug in </w:t>
+            </w:r>
+            <w:r>
+              <w:rPr>
+                <w:color w:val="000000"/>
+                <w:sz w:val="24"/>
+                <w:szCs w:val="24"/>
+              </w:rPr>
+              <w:t>death_drugs</w:t>
+            </w:r>
+            <w:r>
+              <w:rPr>
+                <w:color w:val="000000"/>
+                <w:sz w:val="24"/>
+                <w:szCs w:val="24"/>
+              </w:rPr>
+              <w:t>}} {drug.name}</w:t>
             </w:r>
           </w:p>
         </w:tc>
@@ -1429,7 +1445,7 @@
                 <w:sz w:val="24"/>
                 <w:szCs w:val="24"/>
               </w:rPr>
-              <w:t>Date</w:t>
+              <w:t>Date {drug.date}</w:t>
             </w:r>
           </w:p>
         </w:tc>
@@ -1461,7 +1477,7 @@
                 <w:sz w:val="24"/>
                 <w:szCs w:val="24"/>
               </w:rPr>
-              <w:t>Amount</w:t>
+              <w:t>Amount {drug.amount}</w:t>
             </w:r>
           </w:p>
         </w:tc>
@@ -1493,136 +1509,7 @@
                 <w:sz w:val="24"/>
                 <w:szCs w:val="24"/>
               </w:rPr>
-              <w:t>Concentration</w:t>
-            </w:r>
-          </w:p>
-        </w:tc>
-      </w:tr>
-      <w:tr>
-        <w:trPr/>
-        <w:tc>
-          <w:tcPr>
-            <w:tcW w:w="2366" w:type="dxa"/>
-            <w:tcBorders>
-              <w:top w:val="single" w:sz="4" w:space="0" w:color="000000"/>
-              <w:start w:val="single" w:sz="4" w:space="0" w:color="000000"/>
-              <w:bottom w:val="single" w:sz="4" w:space="0" w:color="000000"/>
-              <w:end w:val="single" w:sz="4" w:space="0" w:color="000000"/>
-            </w:tcBorders>
-          </w:tcPr>
-          <w:p>
-            <w:pPr>
-              <w:pStyle w:val="Normal"/>
-              <w:widowControl w:val="false"/>
-              <w:spacing w:lineRule="atLeast" w:line="100" w:before="0" w:after="0"/>
-              <w:rPr>
-                <w:color w:val="000000"/>
-                <w:sz w:val="24"/>
-                <w:szCs w:val="24"/>
-              </w:rPr>
-            </w:pPr>
-            <w:r>
-              <w:rPr>
-                <w:color w:val="000000"/>
-                <w:sz w:val="24"/>
-                <w:szCs w:val="24"/>
-              </w:rPr>
-              <w:t>[death_drug]</w:t>
-            </w:r>
-          </w:p>
-        </w:tc>
-        <w:tc>
-          <w:tcPr>
-            <w:tcW w:w="2366" w:type="dxa"/>
-            <w:tcBorders>
-              <w:top w:val="single" w:sz="4" w:space="0" w:color="000000"/>
-              <w:start w:val="single" w:sz="4" w:space="0" w:color="000000"/>
-              <w:bottom w:val="single" w:sz="4" w:space="0" w:color="000000"/>
-              <w:end w:val="single" w:sz="4" w:space="0" w:color="000000"/>
-            </w:tcBorders>
-          </w:tcPr>
-          <w:p>
-            <w:pPr>
-              <w:pStyle w:val="Normal"/>
-              <w:widowControl w:val="false"/>
-              <w:spacing w:lineRule="atLeast" w:line="100" w:before="0" w:after="0"/>
-              <w:rPr>
-                <w:color w:val="000000"/>
-                <w:sz w:val="24"/>
-                <w:szCs w:val="24"/>
-              </w:rPr>
-            </w:pPr>
-            <w:r>
-              <w:rPr>
-                <w:color w:val="000000"/>
-                <w:sz w:val="24"/>
-                <w:szCs w:val="24"/>
-              </w:rPr>
-              <w:t>[death_date]</w:t>
-            </w:r>
-          </w:p>
-        </w:tc>
-        <w:tc>
-          <w:tcPr>
-            <w:tcW w:w="2366" w:type="dxa"/>
-            <w:tcBorders>
-              <w:top w:val="single" w:sz="4" w:space="0" w:color="000000"/>
-              <w:start w:val="single" w:sz="4" w:space="0" w:color="000000"/>
-              <w:bottom w:val="single" w:sz="4" w:space="0" w:color="000000"/>
-              <w:end w:val="single" w:sz="4" w:space="0" w:color="000000"/>
-            </w:tcBorders>
-            <w:shd w:color="auto" w:fill="auto" w:val="clear"/>
-          </w:tcPr>
-          <w:p>
-            <w:pPr>
-              <w:pStyle w:val="Normal"/>
-              <w:widowControl w:val="false"/>
-              <w:spacing w:lineRule="atLeast" w:line="100" w:before="0" w:after="0"/>
-              <w:rPr>
-                <w:color w:val="000000"/>
-                <w:sz w:val="24"/>
-                <w:szCs w:val="24"/>
-              </w:rPr>
-            </w:pPr>
-            <w:r>
-              <w:rPr>
-                <w:color w:val="000000"/>
-                <w:sz w:val="24"/>
-                <w:szCs w:val="24"/>
-              </w:rPr>
-              <w:t>[death_drug_amount]</w:t>
-            </w:r>
-          </w:p>
-        </w:tc>
-        <w:tc>
-          <w:tcPr>
-            <w:tcW w:w="2365" w:type="dxa"/>
-            <w:tcBorders>
-              <w:top w:val="single" w:sz="4" w:space="0" w:color="000000"/>
-              <w:start w:val="single" w:sz="4" w:space="0" w:color="000000"/>
-              <w:bottom w:val="single" w:sz="4" w:space="0" w:color="000000"/>
-              <w:end w:val="single" w:sz="4" w:space="0" w:color="000000"/>
-            </w:tcBorders>
-            <w:shd w:color="auto" w:fill="auto" w:val="clear"/>
-          </w:tcPr>
-          <w:p>
-            <w:pPr>
-              <w:pStyle w:val="Normal"/>
-              <w:widowControl w:val="false"/>
-              <w:spacing w:lineRule="atLeast" w:line="100" w:before="0" w:after="0"/>
-              <w:rPr>
-                <w:color w:val="000000"/>
-                <w:sz w:val="24"/>
-                <w:szCs w:val="24"/>
-              </w:rPr>
-            </w:pPr>
-            <w:r>
-              <w:rPr>
-                <w:color w:val="000000"/>
-                <w:sz w:val="24"/>
-                <w:szCs w:val="24"/>
-              </w:rPr>
-              <w:t>[death_drug_concentration]</w:t>
+              <w:t>Concentration {drug.concentration}</w:t>
             </w:r>
           </w:p>
         </w:tc>
@@ -1943,21 +1830,7 @@
           <w:sz w:val="24"/>
           <w:szCs w:val="24"/>
         </w:rPr>
-        <w:t>[sign</w:t>
-      </w:r>
-      <w:r>
-        <w:rPr>
-          <w:sz w:val="24"/>
-          <w:szCs w:val="24"/>
-        </w:rPr>
-        <w:t>a</w:t>
-      </w:r>
-      <w:r>
-        <w:rPr>
-          <w:sz w:val="24"/>
-          <w:szCs w:val="24"/>
-        </w:rPr>
-        <w:t>ture]</w:t>
+        <w:t>[signature]</w:t>
       </w:r>
     </w:p>
     <w:p>
@@ -2028,7 +1901,7 @@
     </w:r>
     <w:r>
       <w:rPr/>
-      <w:t>3</w:t>
+      <w:t>1</w:t>
     </w:r>
     <w:r>
       <w:rPr/>

</xml_diff>

<commit_message>
Fixes #98 and Fixes missing viruses in surgerysheet -
Sets toe-pinch to default.kind=='Anesthetic'.
</commit_message>
<xml_diff>
--- a/templates/surgery_sheet/default.docx
+++ b/templates/surgery_sheet/default.docx
@@ -507,31 +507,71 @@
         </w:rPr>
         <w:t xml:space="preserve">   </w:t>
       </w:r>
-    </w:p>
-    <w:p>
-      <w:pPr>
-        <w:pStyle w:val="Normal"/>
-        <w:bidi w:val="0"/>
-        <w:jc w:val="start"/>
-        <w:rPr>
-          <w:color w:val="000000"/>
-          <w:sz w:val="24"/>
-          <w:szCs w:val="24"/>
-        </w:rPr>
-      </w:pPr>
-      <w:r>
-        <w:rPr>
-          <w:color w:val="000000"/>
-          <w:sz w:val="24"/>
-          <w:szCs w:val="24"/>
-          <w:u w:val="single"/>
-        </w:rPr>
-        <w:t>Post-operative Procedures:</w:t>
+      <w:r>
+        <w:br w:type="page"/>
+      </w:r>
+    </w:p>
+    <w:p>
+      <w:pPr>
+        <w:pStyle w:val="ListParagraph"/>
+        <w:ind w:start="-142" w:hanging="142"/>
+        <w:rPr>
+          <w:b/>
+          <w:b/>
+          <w:color w:val="000000"/>
+          <w:u w:val="single"/>
+        </w:rPr>
+      </w:pPr>
+      <w:r>
+        <w:rPr>
+          <w:b/>
+          <w:color w:val="000000"/>
+          <w:sz w:val="24"/>
+          <w:szCs w:val="24"/>
+          <w:u w:val="single"/>
+        </w:rPr>
+        <w:t>B) Surgery:__________________________________________________________________________</w:t>
+      </w:r>
+    </w:p>
+    <w:p>
+      <w:pPr>
+        <w:pStyle w:val="Normal"/>
+        <w:rPr>
+          <w:color w:val="000000"/>
+          <w:sz w:val="24"/>
+          <w:szCs w:val="24"/>
+        </w:rPr>
+      </w:pPr>
+      <w:r>
+        <w:rPr>
+          <w:color w:val="000000"/>
+          <w:sz w:val="24"/>
+          <w:szCs w:val="24"/>
+        </w:rPr>
+      </w:r>
+    </w:p>
+    <w:p>
+      <w:pPr>
+        <w:pStyle w:val="Normal"/>
+        <w:rPr>
+          <w:color w:val="000000"/>
+          <w:sz w:val="24"/>
+          <w:szCs w:val="24"/>
+        </w:rPr>
+      </w:pPr>
+      <w:r>
+        <w:rPr>
+          <w:color w:val="000000"/>
+          <w:sz w:val="24"/>
+          <w:szCs w:val="24"/>
+          <w:u w:val="single"/>
+        </w:rPr>
+        <w:t>Virus Injections:</w:t>
       </w:r>
     </w:p>
     <w:tbl>
       <w:tblPr>
-        <w:tblW w:w="9691" w:type="dxa"/>
+        <w:tblW w:w="9464" w:type="dxa"/>
         <w:jc w:val="start"/>
         <w:tblInd w:w="-113" w:type="dxa"/>
         <w:tblLayout w:type="fixed"/>
@@ -544,141 +584,108 @@
         <w:tblLook w:val="0000" w:noHBand="0" w:noVBand="0" w:firstColumn="0" w:lastRow="0" w:lastColumn="0" w:firstRow="0"/>
       </w:tblPr>
       <w:tblGrid>
-        <w:gridCol w:w="3230"/>
-        <w:gridCol w:w="3230"/>
-        <w:gridCol w:w="3231"/>
+        <w:gridCol w:w="2984"/>
+        <w:gridCol w:w="2970"/>
+        <w:gridCol w:w="3510"/>
       </w:tblGrid>
       <w:tr>
         <w:trPr/>
         <w:tc>
           <w:tcPr>
-            <w:tcW w:w="3230" w:type="dxa"/>
-            <w:tcBorders>
-              <w:top w:val="single" w:sz="4" w:space="0" w:color="000000"/>
-              <w:start w:val="single" w:sz="4" w:space="0" w:color="000000"/>
-              <w:bottom w:val="single" w:sz="4" w:space="0" w:color="000000"/>
-              <w:end w:val="single" w:sz="4" w:space="0" w:color="000000"/>
-            </w:tcBorders>
-            <w:shd w:color="auto" w:fill="auto" w:val="clear"/>
-          </w:tcPr>
-          <w:p>
-            <w:pPr>
-              <w:pStyle w:val="Normal"/>
-              <w:widowControl w:val="false"/>
-              <w:bidi w:val="0"/>
-              <w:spacing w:before="0" w:after="0"/>
-              <w:jc w:val="start"/>
-              <w:rPr/>
-            </w:pPr>
-            <w:r>
-              <w:rPr/>
-              <w:t>Procedure: {{p in post_procedures}} {p.name}</w:t>
-            </w:r>
-          </w:p>
-        </w:tc>
-        <w:tc>
-          <w:tcPr>
-            <w:tcW w:w="3230" w:type="dxa"/>
-            <w:tcBorders>
-              <w:top w:val="single" w:sz="4" w:space="0" w:color="000000"/>
-              <w:start w:val="single" w:sz="4" w:space="0" w:color="000000"/>
-              <w:bottom w:val="single" w:sz="4" w:space="0" w:color="000000"/>
-              <w:end w:val="single" w:sz="4" w:space="0" w:color="000000"/>
-            </w:tcBorders>
-            <w:shd w:color="auto" w:fill="auto" w:val="clear"/>
-          </w:tcPr>
-          <w:p>
-            <w:pPr>
-              <w:pStyle w:val="Normal"/>
-              <w:widowControl w:val="false"/>
-              <w:bidi w:val="0"/>
-              <w:spacing w:before="0" w:after="0"/>
-              <w:jc w:val="start"/>
-              <w:rPr/>
-            </w:pPr>
-            <w:r>
-              <w:rPr/>
-              <w:t>Date of procedure: {p.start_date}</w:t>
-            </w:r>
-          </w:p>
-        </w:tc>
-        <w:tc>
-          <w:tcPr>
-            <w:tcW w:w="3231" w:type="dxa"/>
-            <w:tcBorders>
-              <w:top w:val="single" w:sz="4" w:space="0" w:color="000000"/>
-              <w:start w:val="single" w:sz="4" w:space="0" w:color="000000"/>
-              <w:bottom w:val="single" w:sz="4" w:space="0" w:color="000000"/>
-              <w:end w:val="single" w:sz="4" w:space="0" w:color="000000"/>
-            </w:tcBorders>
-            <w:shd w:color="auto" w:fill="auto" w:val="clear"/>
-          </w:tcPr>
-          <w:p>
-            <w:pPr>
-              <w:pStyle w:val="Normal"/>
-              <w:widowControl w:val="false"/>
-              <w:bidi w:val="0"/>
-              <w:spacing w:before="0" w:after="0"/>
-              <w:jc w:val="start"/>
-              <w:rPr/>
-            </w:pPr>
-            <w:r>
-              <w:rPr/>
-              <w:t>Experimenter: {user}</w:t>
+            <w:tcW w:w="2984" w:type="dxa"/>
+            <w:tcBorders>
+              <w:top w:val="single" w:sz="4" w:space="0" w:color="000000"/>
+              <w:start w:val="single" w:sz="4" w:space="0" w:color="000000"/>
+              <w:bottom w:val="single" w:sz="4" w:space="0" w:color="000000"/>
+              <w:end w:val="single" w:sz="4" w:space="0" w:color="000000"/>
+            </w:tcBorders>
+          </w:tcPr>
+          <w:p>
+            <w:pPr>
+              <w:pStyle w:val="Normal"/>
+              <w:widowControl w:val="false"/>
+              <w:spacing w:lineRule="atLeast" w:line="100" w:before="0" w:after="0"/>
+              <w:rPr>
+                <w:color w:val="000000"/>
+                <w:sz w:val="24"/>
+                <w:szCs w:val="24"/>
+              </w:rPr>
+            </w:pPr>
+            <w:r>
+              <w:rPr>
+                <w:color w:val="000000"/>
+                <w:sz w:val="24"/>
+                <w:szCs w:val="24"/>
+              </w:rPr>
+              <w:t>Virus {{virus in viruses}} {virus.name}</w:t>
+            </w:r>
+          </w:p>
+        </w:tc>
+        <w:tc>
+          <w:tcPr>
+            <w:tcW w:w="2970" w:type="dxa"/>
+            <w:tcBorders>
+              <w:top w:val="single" w:sz="4" w:space="0" w:color="000000"/>
+              <w:start w:val="single" w:sz="4" w:space="0" w:color="000000"/>
+              <w:bottom w:val="single" w:sz="4" w:space="0" w:color="000000"/>
+              <w:end w:val="single" w:sz="4" w:space="0" w:color="000000"/>
+            </w:tcBorders>
+          </w:tcPr>
+          <w:p>
+            <w:pPr>
+              <w:pStyle w:val="Normal"/>
+              <w:widowControl w:val="false"/>
+              <w:spacing w:lineRule="atLeast" w:line="100" w:before="0" w:after="0"/>
+              <w:rPr>
+                <w:color w:val="000000"/>
+                <w:sz w:val="24"/>
+                <w:szCs w:val="24"/>
+              </w:rPr>
+            </w:pPr>
+            <w:r>
+              <w:rPr>
+                <w:color w:val="000000"/>
+                <w:sz w:val="24"/>
+                <w:szCs w:val="24"/>
+              </w:rPr>
+              <w:t>Date {virus.date}</w:t>
+            </w:r>
+          </w:p>
+        </w:tc>
+        <w:tc>
+          <w:tcPr>
+            <w:tcW w:w="3510" w:type="dxa"/>
+            <w:tcBorders>
+              <w:top w:val="single" w:sz="4" w:space="0" w:color="000000"/>
+              <w:start w:val="single" w:sz="4" w:space="0" w:color="000000"/>
+              <w:bottom w:val="single" w:sz="4" w:space="0" w:color="000000"/>
+              <w:end w:val="single" w:sz="4" w:space="0" w:color="000000"/>
+            </w:tcBorders>
+            <w:shd w:color="auto" w:fill="auto" w:val="clear"/>
+          </w:tcPr>
+          <w:p>
+            <w:pPr>
+              <w:pStyle w:val="Normal"/>
+              <w:widowControl w:val="false"/>
+              <w:spacing w:lineRule="atLeast" w:line="100" w:before="0" w:after="0"/>
+              <w:rPr>
+                <w:color w:val="000000"/>
+                <w:sz w:val="24"/>
+                <w:szCs w:val="24"/>
+              </w:rPr>
+            </w:pPr>
+            <w:r>
+              <w:rPr>
+                <w:color w:val="000000"/>
+                <w:sz w:val="24"/>
+                <w:szCs w:val="24"/>
+              </w:rPr>
+              <w:t>Amount (μl)  {virus.amount}</w:t>
             </w:r>
           </w:p>
         </w:tc>
       </w:tr>
     </w:tbl>
-    <w:p>
-      <w:pPr>
-        <w:pStyle w:val="Normal"/>
-        <w:bidi w:val="0"/>
-        <w:jc w:val="start"/>
-        <w:rPr>
-          <w:b/>
-          <w:b/>
-          <w:bCs/>
-          <w:color w:val="000000"/>
-          <w:sz w:val="24"/>
-          <w:szCs w:val="24"/>
-        </w:rPr>
-      </w:pPr>
-      <w:r>
-        <w:rPr>
-          <w:b/>
-          <w:bCs/>
-          <w:color w:val="000000"/>
-          <w:sz w:val="24"/>
-          <w:szCs w:val="24"/>
-        </w:rPr>
-      </w:r>
-      <w:r>
-        <w:br w:type="page"/>
-      </w:r>
-    </w:p>
-    <w:p>
-      <w:pPr>
-        <w:pStyle w:val="ListParagraph"/>
-        <w:ind w:start="-142" w:hanging="142"/>
-        <w:rPr>
-          <w:b/>
-          <w:b/>
-          <w:color w:val="000000"/>
-          <w:u w:val="single"/>
-        </w:rPr>
-      </w:pPr>
-      <w:r>
-        <w:rPr>
-          <w:b/>
-          <w:color w:val="000000"/>
-          <w:sz w:val="24"/>
-          <w:szCs w:val="24"/>
-          <w:u w:val="single"/>
-        </w:rPr>
-        <w:t>B) Surgery:__________________________________________________________________________</w:t>
-      </w:r>
-    </w:p>
     <w:p>
       <w:pPr>
         <w:pStyle w:val="Normal"/>
@@ -732,9 +739,9 @@
       <w:tblGrid>
         <w:gridCol w:w="1892"/>
         <w:gridCol w:w="1893"/>
-        <w:gridCol w:w="1450"/>
+        <w:gridCol w:w="1448"/>
         <w:gridCol w:w="2610"/>
-        <w:gridCol w:w="1619"/>
+        <w:gridCol w:w="1621"/>
       </w:tblGrid>
       <w:tr>
         <w:trPr/>
@@ -765,39 +772,7 @@
                 <w:sz w:val="24"/>
                 <w:szCs w:val="24"/>
               </w:rPr>
-              <w:t>Anesthetic {{drug in medication where kind==</w:t>
-            </w:r>
-            <w:r>
-              <w:rPr>
-                <w:color w:val="000000"/>
-                <w:sz w:val="24"/>
-                <w:szCs w:val="24"/>
-              </w:rPr>
-              <w:t>A</w:t>
-            </w:r>
-            <w:r>
-              <w:rPr>
-                <w:color w:val="000000"/>
-                <w:sz w:val="24"/>
-                <w:szCs w:val="24"/>
-              </w:rPr>
-              <w:t>nesth</w:t>
-            </w:r>
-            <w:r>
-              <w:rPr>
-                <w:color w:val="000000"/>
-                <w:sz w:val="24"/>
-                <w:szCs w:val="24"/>
-              </w:rPr>
-              <w:t>etic</w:t>
-            </w:r>
-            <w:r>
-              <w:rPr>
-                <w:color w:val="000000"/>
-                <w:sz w:val="24"/>
-                <w:szCs w:val="24"/>
-              </w:rPr>
-              <w:t>}} {drug.name}</w:t>
+              <w:t>Anesthetic {{drug in medication where kind==Anesthetic}} {drug.name}</w:t>
             </w:r>
           </w:p>
         </w:tc>
@@ -834,7 +809,7 @@
         </w:tc>
         <w:tc>
           <w:tcPr>
-            <w:tcW w:w="1450" w:type="dxa"/>
+            <w:tcW w:w="1448" w:type="dxa"/>
             <w:tcBorders>
               <w:top w:val="single" w:sz="4" w:space="0" w:color="000000"/>
               <w:start w:val="single" w:sz="4" w:space="0" w:color="000000"/>
@@ -898,7 +873,7 @@
         </w:tc>
         <w:tc>
           <w:tcPr>
-            <w:tcW w:w="1619" w:type="dxa"/>
+            <w:tcW w:w="1621" w:type="dxa"/>
             <w:tcBorders>
               <w:top w:val="single" w:sz="4" w:space="0" w:color="000000"/>
               <w:start w:val="single" w:sz="4" w:space="0" w:color="000000"/>
@@ -1216,39 +1191,7 @@
                 <w:sz w:val="24"/>
                 <w:szCs w:val="24"/>
               </w:rPr>
-              <w:t>Analgesic {{drug in medication where kind==</w:t>
-            </w:r>
-            <w:r>
-              <w:rPr>
-                <w:color w:val="000000"/>
-                <w:sz w:val="24"/>
-                <w:szCs w:val="24"/>
-              </w:rPr>
-              <w:t>A</w:t>
-            </w:r>
-            <w:r>
-              <w:rPr>
-                <w:color w:val="000000"/>
-                <w:sz w:val="24"/>
-                <w:szCs w:val="24"/>
-              </w:rPr>
-              <w:t>nalge</w:t>
-            </w:r>
-            <w:r>
-              <w:rPr>
-                <w:color w:val="000000"/>
-                <w:sz w:val="24"/>
-                <w:szCs w:val="24"/>
-              </w:rPr>
-              <w:t>sic</w:t>
-            </w:r>
-            <w:r>
-              <w:rPr>
-                <w:color w:val="000000"/>
-                <w:sz w:val="24"/>
-                <w:szCs w:val="24"/>
-              </w:rPr>
-              <w:t>}} {drug.name}</w:t>
+              <w:t>Analgesic {{drug in medication where kind==Analgesic}} {drug.name}</w:t>
             </w:r>
           </w:p>
         </w:tc>
@@ -1949,7 +1892,7 @@
     </w:r>
     <w:r>
       <w:rPr/>
-      <w:t>1</w:t>
+      <w:t>3</w:t>
     </w:r>
     <w:r>
       <w:rPr/>
@@ -2162,5 +2105,28 @@
     </w:pPr>
     <w:rPr/>
   </w:style>
+  <w:style w:type="paragraph" w:styleId="TableContents">
+    <w:name w:val="Table Contents"/>
+    <w:basedOn w:val="Normal"/>
+    <w:qFormat/>
+    <w:pPr>
+      <w:widowControl w:val="false"/>
+      <w:suppressLineNumbers/>
+    </w:pPr>
+    <w:rPr/>
+  </w:style>
+  <w:style w:type="paragraph" w:styleId="TableHeading">
+    <w:name w:val="Table Heading"/>
+    <w:basedOn w:val="TableContents"/>
+    <w:qFormat/>
+    <w:pPr>
+      <w:suppressLineNumbers/>
+      <w:jc w:val="center"/>
+    </w:pPr>
+    <w:rPr>
+      <w:b/>
+      <w:bCs/>
+    </w:rPr>
+  </w:style>
 </w:styles>
 </file>
</xml_diff>

<commit_message>
Fixes #143 - typo in surgery-sheet
</commit_message>
<xml_diff>
--- a/templates/surgery_sheet/default.docx
+++ b/templates/surgery_sheet/default.docx
@@ -345,7 +345,6 @@
         <w:jc w:val="start"/>
         <w:rPr>
           <w:b/>
-          <w:b/>
           <w:bCs/>
           <w:color w:val="000000"/>
           <w:sz w:val="24"/>
@@ -492,7 +491,6 @@
         <w:jc w:val="start"/>
         <w:rPr>
           <w:b/>
-          <w:b/>
           <w:color w:val="000000"/>
           <w:sz w:val="24"/>
           <w:szCs w:val="24"/>
@@ -516,7 +514,6 @@
         <w:pStyle w:val="ListParagraph"/>
         <w:ind w:start="-142" w:hanging="142"/>
         <w:rPr>
-          <w:b/>
           <w:b/>
           <w:color w:val="000000"/>
           <w:u w:val="single"/>
@@ -584,15 +581,15 @@
         <w:tblLook w:val="0000" w:noHBand="0" w:noVBand="0" w:firstColumn="0" w:lastRow="0" w:lastColumn="0" w:firstRow="0"/>
       </w:tblPr>
       <w:tblGrid>
-        <w:gridCol w:w="2984"/>
+        <w:gridCol w:w="2983"/>
         <w:gridCol w:w="2970"/>
-        <w:gridCol w:w="3510"/>
+        <w:gridCol w:w="3511"/>
       </w:tblGrid>
       <w:tr>
         <w:trPr/>
         <w:tc>
           <w:tcPr>
-            <w:tcW w:w="2984" w:type="dxa"/>
+            <w:tcW w:w="2983" w:type="dxa"/>
             <w:tcBorders>
               <w:top w:val="single" w:sz="4" w:space="0" w:color="000000"/>
               <w:start w:val="single" w:sz="4" w:space="0" w:color="000000"/>
@@ -654,7 +651,7 @@
         </w:tc>
         <w:tc>
           <w:tcPr>
-            <w:tcW w:w="3510" w:type="dxa"/>
+            <w:tcW w:w="3511" w:type="dxa"/>
             <w:tcBorders>
               <w:top w:val="single" w:sz="4" w:space="0" w:color="000000"/>
               <w:start w:val="single" w:sz="4" w:space="0" w:color="000000"/>
@@ -739,9 +736,9 @@
       <w:tblGrid>
         <w:gridCol w:w="1892"/>
         <w:gridCol w:w="1893"/>
-        <w:gridCol w:w="1448"/>
+        <w:gridCol w:w="1447"/>
         <w:gridCol w:w="2610"/>
-        <w:gridCol w:w="1621"/>
+        <w:gridCol w:w="1622"/>
       </w:tblGrid>
       <w:tr>
         <w:trPr/>
@@ -809,7 +806,7 @@
         </w:tc>
         <w:tc>
           <w:tcPr>
-            <w:tcW w:w="1448" w:type="dxa"/>
+            <w:tcW w:w="1447" w:type="dxa"/>
             <w:tcBorders>
               <w:top w:val="single" w:sz="4" w:space="0" w:color="000000"/>
               <w:start w:val="single" w:sz="4" w:space="0" w:color="000000"/>
@@ -873,7 +870,7 @@
         </w:tc>
         <w:tc>
           <w:tcPr>
-            <w:tcW w:w="1621" w:type="dxa"/>
+            <w:tcW w:w="1622" w:type="dxa"/>
             <w:tcBorders>
               <w:top w:val="single" w:sz="4" w:space="0" w:color="000000"/>
               <w:start w:val="single" w:sz="4" w:space="0" w:color="000000"/>
@@ -909,7 +906,6 @@
         <w:pStyle w:val="Normal"/>
         <w:spacing w:lineRule="auto" w:line="240"/>
         <w:rPr>
-          <w:b/>
           <w:b/>
           <w:color w:val="000000"/>
           <w:sz w:val="24"/>
@@ -1091,7 +1087,7 @@
                 <w:sz w:val="24"/>
                 <w:szCs w:val="24"/>
               </w:rPr>
-              <w:t>Treatments {“analgestic”}</w:t>
+              <w:t>Treatments {“analgesic”}</w:t>
             </w:r>
           </w:p>
         </w:tc>
@@ -1340,7 +1336,6 @@
         <w:ind w:hanging="0"/>
         <w:rPr>
           <w:b/>
-          <w:b/>
           <w:color w:val="000000"/>
           <w:u w:val="single"/>
         </w:rPr>
@@ -1511,14 +1506,25 @@
         <w:pStyle w:val="Normal"/>
         <w:rPr>
           <w:b/>
+          <w:color w:val="000000"/>
+          <w:sz w:val="24"/>
+          <w:szCs w:val="24"/>
+          <w:u w:val="single"/>
+        </w:rPr>
+      </w:pPr>
+      <w:r>
+        <w:rPr>
           <w:b/>
           <w:color w:val="000000"/>
           <w:sz w:val="24"/>
           <w:szCs w:val="24"/>
           <w:u w:val="single"/>
         </w:rPr>
-      </w:pPr>
-      <w:r>
+      </w:r>
+    </w:p>
+    <w:p>
+      <w:pPr>
+        <w:pStyle w:val="Normal"/>
         <w:rPr>
           <w:b/>
           <w:color w:val="000000"/>
@@ -1526,35 +1532,21 @@
           <w:szCs w:val="24"/>
           <w:u w:val="single"/>
         </w:rPr>
-      </w:r>
-    </w:p>
-    <w:p>
-      <w:pPr>
-        <w:pStyle w:val="Normal"/>
+      </w:pPr>
+      <w:r>
         <w:rPr>
           <w:b/>
-          <w:b/>
-          <w:color w:val="000000"/>
-          <w:sz w:val="24"/>
-          <w:szCs w:val="24"/>
-          <w:u w:val="single"/>
-        </w:rPr>
-      </w:pPr>
-      <w:r>
-        <w:rPr>
-          <w:b/>
-          <w:color w:val="000000"/>
-          <w:sz w:val="24"/>
-          <w:szCs w:val="24"/>
-          <w:u w:val="single"/>
-        </w:rPr>
-      </w:r>
-    </w:p>
-    <w:p>
-      <w:pPr>
-        <w:pStyle w:val="Normal"/>
-        <w:rPr>
-          <w:b/>
+          <w:color w:val="000000"/>
+          <w:sz w:val="24"/>
+          <w:szCs w:val="24"/>
+          <w:u w:val="single"/>
+        </w:rPr>
+      </w:r>
+    </w:p>
+    <w:p>
+      <w:pPr>
+        <w:pStyle w:val="Normal"/>
+        <w:rPr>
           <w:b/>
           <w:color w:val="000000"/>
           <w:sz w:val="24"/>
@@ -1579,28 +1571,26 @@
         <w:pStyle w:val="Normal"/>
         <w:rPr>
           <w:b/>
+          <w:color w:val="000000"/>
+          <w:sz w:val="24"/>
+          <w:szCs w:val="24"/>
+          <w:u w:val="single"/>
+        </w:rPr>
+      </w:pPr>
+      <w:r>
+        <w:rPr>
           <w:b/>
           <w:color w:val="000000"/>
           <w:sz w:val="24"/>
           <w:szCs w:val="24"/>
           <w:u w:val="single"/>
         </w:rPr>
-      </w:pPr>
-      <w:r>
-        <w:rPr>
-          <w:b/>
-          <w:color w:val="000000"/>
-          <w:sz w:val="24"/>
-          <w:szCs w:val="24"/>
-          <w:u w:val="single"/>
-        </w:rPr>
-      </w:r>
-    </w:p>
-    <w:p>
-      <w:pPr>
-        <w:pStyle w:val="Normal"/>
-        <w:rPr>
-          <w:b/>
+      </w:r>
+    </w:p>
+    <w:p>
+      <w:pPr>
+        <w:pStyle w:val="Normal"/>
+        <w:rPr>
           <w:b/>
           <w:color w:val="000000"/>
           <w:sz w:val="24"/>

</xml_diff>

<commit_message>
working on #228 - adds unexpected events, removes sacrifice procedure
</commit_message>
<xml_diff>
--- a/templates/surgery_sheet/default.docx
+++ b/templates/surgery_sheet/default.docx
@@ -27,7 +27,7 @@
       <w:pPr>
         <w:pStyle w:val="Normal"/>
         <w:bidi w:val="0"/>
-        <w:ind w:start="-284" w:hanging="0"/>
+        <w:ind w:hanging="0" w:start="-284"/>
         <w:jc w:val="start"/>
         <w:rPr>
           <w:color w:val="000000"/>
@@ -487,7 +487,7 @@
         <w:pStyle w:val="ListParagraph"/>
         <w:bidi w:val="0"/>
         <w:spacing w:before="0" w:after="0"/>
-        <w:ind w:start="-142" w:hanging="142"/>
+        <w:ind w:hanging="142" w:start="-142"/>
         <w:jc w:val="start"/>
         <w:rPr>
           <w:b/>
@@ -512,7 +512,8 @@
     <w:p>
       <w:pPr>
         <w:pStyle w:val="ListParagraph"/>
-        <w:ind w:start="-142" w:hanging="142"/>
+        <w:spacing w:before="0" w:after="0"/>
+        <w:ind w:hanging="142" w:start="-142"/>
         <w:rPr>
           <w:b/>
           <w:color w:val="000000"/>
@@ -582,8 +583,8 @@
       </w:tblPr>
       <w:tblGrid>
         <w:gridCol w:w="2983"/>
-        <w:gridCol w:w="2968"/>
-        <w:gridCol w:w="3513"/>
+        <w:gridCol w:w="2967"/>
+        <w:gridCol w:w="3514"/>
       </w:tblGrid>
       <w:tr>
         <w:trPr/>
@@ -620,7 +621,7 @@
         </w:tc>
         <w:tc>
           <w:tcPr>
-            <w:tcW w:w="2968" w:type="dxa"/>
+            <w:tcW w:w="2967" w:type="dxa"/>
             <w:tcBorders>
               <w:top w:val="single" w:sz="4" w:space="0" w:color="000000"/>
               <w:start w:val="single" w:sz="4" w:space="0" w:color="000000"/>
@@ -651,7 +652,7 @@
         </w:tc>
         <w:tc>
           <w:tcPr>
-            <w:tcW w:w="3513" w:type="dxa"/>
+            <w:tcW w:w="3514" w:type="dxa"/>
             <w:tcBorders>
               <w:top w:val="single" w:sz="4" w:space="0" w:color="000000"/>
               <w:start w:val="single" w:sz="4" w:space="0" w:color="000000"/>
@@ -736,9 +737,9 @@
       <w:tblGrid>
         <w:gridCol w:w="1892"/>
         <w:gridCol w:w="1893"/>
-        <w:gridCol w:w="1445"/>
-        <w:gridCol w:w="2610"/>
-        <w:gridCol w:w="1624"/>
+        <w:gridCol w:w="1443"/>
+        <w:gridCol w:w="2611"/>
+        <w:gridCol w:w="1625"/>
       </w:tblGrid>
       <w:tr>
         <w:trPr/>
@@ -806,7 +807,7 @@
         </w:tc>
         <w:tc>
           <w:tcPr>
-            <w:tcW w:w="1445" w:type="dxa"/>
+            <w:tcW w:w="1443" w:type="dxa"/>
             <w:tcBorders>
               <w:top w:val="single" w:sz="4" w:space="0" w:color="000000"/>
               <w:start w:val="single" w:sz="4" w:space="0" w:color="000000"/>
@@ -838,7 +839,7 @@
         </w:tc>
         <w:tc>
           <w:tcPr>
-            <w:tcW w:w="2610" w:type="dxa"/>
+            <w:tcW w:w="2611" w:type="dxa"/>
             <w:tcBorders>
               <w:top w:val="single" w:sz="4" w:space="0" w:color="000000"/>
               <w:start w:val="single" w:sz="4" w:space="0" w:color="000000"/>
@@ -870,7 +871,7 @@
         </w:tc>
         <w:tc>
           <w:tcPr>
-            <w:tcW w:w="1624" w:type="dxa"/>
+            <w:tcW w:w="1625" w:type="dxa"/>
             <w:tcBorders>
               <w:top w:val="single" w:sz="4" w:space="0" w:color="000000"/>
               <w:start w:val="single" w:sz="4" w:space="0" w:color="000000"/>
@@ -1498,6 +1499,7 @@
     <w:p>
       <w:pPr>
         <w:pStyle w:val="Normal"/>
+        <w:spacing w:before="0" w:after="0"/>
         <w:rPr>
           <w:color w:val="000000"/>
         </w:rPr>
@@ -1797,19 +1799,7 @@
         <w:rPr>
           <w:color w:val="000000"/>
         </w:rPr>
-      </w:r>
-    </w:p>
-    <w:p>
-      <w:pPr>
-        <w:pStyle w:val="Normal"/>
-        <w:rPr>
-          <w:color w:val="000000"/>
-        </w:rPr>
-      </w:pPr>
-      <w:r>
-        <w:rPr>
-          <w:color w:val="000000"/>
-        </w:rPr>
+        <w:t>[unexpected_events]</w:t>
       </w:r>
     </w:p>
     <w:p>
@@ -2024,8 +2014,12 @@
       </w:r>
     </w:p>
     <w:sectPr>
-      <w:headerReference w:type="default" r:id="rId2"/>
-      <w:footerReference w:type="default" r:id="rId3"/>
+      <w:headerReference w:type="even" r:id="rId2"/>
+      <w:headerReference w:type="default" r:id="rId3"/>
+      <w:headerReference w:type="first" r:id="rId4"/>
+      <w:footerReference w:type="even" r:id="rId5"/>
+      <w:footerReference w:type="default" r:id="rId6"/>
+      <w:footerReference w:type="first" r:id="rId7"/>
       <w:type w:val="nextPage"/>
       <w:pgSz w:w="12240" w:h="15840"/>
       <w:pgMar w:left="1134" w:right="1134" w:gutter="0" w:header="1134" w:top="2245" w:footer="1134" w:bottom="1693"/>
@@ -2039,6 +2033,52 @@
 </file>
 
 <file path=word/footer1.xml><?xml version="1.0" encoding="utf-8"?>
+<w:ftr xmlns:o="urn:schemas-microsoft-com:office:office" xmlns:r="http://schemas.openxmlformats.org/officeDocument/2006/relationships" xmlns:v="urn:schemas-microsoft-com:vml" xmlns:w="http://schemas.openxmlformats.org/wordprocessingml/2006/main" xmlns:w10="urn:schemas-microsoft-com:office:word" xmlns:wp="http://schemas.openxmlformats.org/drawingml/2006/wordprocessingDrawing" xmlns:wps="http://schemas.microsoft.com/office/word/2010/wordprocessingShape" xmlns:wpg="http://schemas.microsoft.com/office/word/2010/wordprocessingGroup" xmlns:mc="http://schemas.openxmlformats.org/markup-compatibility/2006" xmlns:wp14="http://schemas.microsoft.com/office/word/2010/wordprocessingDrawing" xmlns:w14="http://schemas.microsoft.com/office/word/2010/wordml" xmlns:w15="http://schemas.microsoft.com/office/word/2012/wordml" mc:Ignorable="w14 wp14 w15">
+  <w:p>
+    <w:pPr>
+      <w:pStyle w:val="Footer"/>
+      <w:rPr/>
+    </w:pPr>
+    <w:r>
+      <w:rPr/>
+    </w:r>
+  </w:p>
+</w:ftr>
+</file>
+
+<file path=word/footer2.xml><?xml version="1.0" encoding="utf-8"?>
+<w:ftr xmlns:o="urn:schemas-microsoft-com:office:office" xmlns:r="http://schemas.openxmlformats.org/officeDocument/2006/relationships" xmlns:v="urn:schemas-microsoft-com:vml" xmlns:w="http://schemas.openxmlformats.org/wordprocessingml/2006/main" xmlns:w10="urn:schemas-microsoft-com:office:word" xmlns:wp="http://schemas.openxmlformats.org/drawingml/2006/wordprocessingDrawing" xmlns:wps="http://schemas.microsoft.com/office/word/2010/wordprocessingShape" xmlns:wpg="http://schemas.microsoft.com/office/word/2010/wordprocessingGroup" xmlns:mc="http://schemas.openxmlformats.org/markup-compatibility/2006" xmlns:wp14="http://schemas.microsoft.com/office/word/2010/wordprocessingDrawing" xmlns:w14="http://schemas.microsoft.com/office/word/2010/wordml" xmlns:w15="http://schemas.microsoft.com/office/word/2012/wordml" mc:Ignorable="w14 wp14 w15">
+  <w:p>
+    <w:pPr>
+      <w:pStyle w:val="Footer"/>
+      <w:jc w:val="end"/>
+      <w:rPr/>
+    </w:pPr>
+    <w:r>
+      <w:rPr/>
+      <w:fldChar w:fldCharType="begin"/>
+    </w:r>
+    <w:r>
+      <w:rPr/>
+      <w:instrText xml:space="preserve"> PAGE </w:instrText>
+    </w:r>
+    <w:r>
+      <w:rPr/>
+      <w:fldChar w:fldCharType="separate"/>
+    </w:r>
+    <w:r>
+      <w:rPr/>
+      <w:t>3</w:t>
+    </w:r>
+    <w:r>
+      <w:rPr/>
+      <w:fldChar w:fldCharType="end"/>
+    </w:r>
+  </w:p>
+</w:ftr>
+</file>
+
+<file path=word/footer3.xml><?xml version="1.0" encoding="utf-8"?>
 <w:ftr xmlns:o="urn:schemas-microsoft-com:office:office" xmlns:r="http://schemas.openxmlformats.org/officeDocument/2006/relationships" xmlns:v="urn:schemas-microsoft-com:vml" xmlns:w="http://schemas.openxmlformats.org/wordprocessingml/2006/main" xmlns:w10="urn:schemas-microsoft-com:office:word" xmlns:wp="http://schemas.openxmlformats.org/drawingml/2006/wordprocessingDrawing" xmlns:wps="http://schemas.microsoft.com/office/word/2010/wordprocessingShape" xmlns:wpg="http://schemas.microsoft.com/office/word/2010/wordprocessingGroup" xmlns:mc="http://schemas.openxmlformats.org/markup-compatibility/2006" xmlns:wp14="http://schemas.microsoft.com/office/word/2010/wordprocessingDrawing" xmlns:w14="http://schemas.microsoft.com/office/word/2010/wordml" xmlns:w15="http://schemas.microsoft.com/office/word/2012/wordml" mc:Ignorable="w14 wp14 w15">
   <w:p>
     <w:pPr>
@@ -2074,9 +2114,23 @@
 <w:hdr xmlns:o="urn:schemas-microsoft-com:office:office" xmlns:r="http://schemas.openxmlformats.org/officeDocument/2006/relationships" xmlns:v="urn:schemas-microsoft-com:vml" xmlns:w="http://schemas.openxmlformats.org/wordprocessingml/2006/main" xmlns:w10="urn:schemas-microsoft-com:office:word" xmlns:wp="http://schemas.openxmlformats.org/drawingml/2006/wordprocessingDrawing" xmlns:wps="http://schemas.microsoft.com/office/word/2010/wordprocessingShape" xmlns:wpg="http://schemas.microsoft.com/office/word/2010/wordprocessingGroup" xmlns:mc="http://schemas.openxmlformats.org/markup-compatibility/2006" xmlns:wp14="http://schemas.microsoft.com/office/word/2010/wordprocessingDrawing" xmlns:w14="http://schemas.microsoft.com/office/word/2010/wordml" xmlns:w15="http://schemas.microsoft.com/office/word/2012/wordml" mc:Ignorable="w14 wp14 w15">
   <w:p>
     <w:pPr>
+      <w:pStyle w:val="Header"/>
+      <w:rPr/>
+    </w:pPr>
+    <w:r>
+      <w:rPr/>
+    </w:r>
+  </w:p>
+</w:hdr>
+</file>
+
+<file path=word/header2.xml><?xml version="1.0" encoding="utf-8"?>
+<w:hdr xmlns:o="urn:schemas-microsoft-com:office:office" xmlns:r="http://schemas.openxmlformats.org/officeDocument/2006/relationships" xmlns:v="urn:schemas-microsoft-com:vml" xmlns:w="http://schemas.openxmlformats.org/wordprocessingml/2006/main" xmlns:w10="urn:schemas-microsoft-com:office:word" xmlns:wp="http://schemas.openxmlformats.org/drawingml/2006/wordprocessingDrawing" xmlns:wps="http://schemas.microsoft.com/office/word/2010/wordprocessingShape" xmlns:wpg="http://schemas.microsoft.com/office/word/2010/wordprocessingGroup" xmlns:mc="http://schemas.openxmlformats.org/markup-compatibility/2006" xmlns:wp14="http://schemas.microsoft.com/office/word/2010/wordprocessingDrawing" xmlns:w14="http://schemas.microsoft.com/office/word/2010/wordml" xmlns:w15="http://schemas.microsoft.com/office/word/2012/wordml" mc:Ignorable="w14 wp14 w15">
+  <w:p>
+    <w:pPr>
       <w:pStyle w:val="Normal"/>
       <w:bidi w:val="0"/>
-      <w:ind w:start="-284" w:hanging="0"/>
+      <w:ind w:hanging="0" w:start="-284"/>
       <w:jc w:val="end"/>
       <w:rPr>
         <w:color w:val="000000"/>
@@ -2097,7 +2151,7 @@
     <w:pPr>
       <w:pStyle w:val="Normal"/>
       <w:bidi w:val="0"/>
-      <w:ind w:start="-284" w:hanging="0"/>
+      <w:ind w:hanging="0" w:start="-284"/>
       <w:jc w:val="end"/>
       <w:rPr>
         <w:color w:val="000000"/>
@@ -2118,7 +2172,75 @@
     <w:pPr>
       <w:pStyle w:val="Normal"/>
       <w:bidi w:val="0"/>
-      <w:ind w:start="-284" w:hanging="0"/>
+      <w:ind w:hanging="0" w:start="-284"/>
+      <w:jc w:val="end"/>
+      <w:rPr>
+        <w:color w:val="000000"/>
+      </w:rPr>
+    </w:pPr>
+    <w:r>
+      <w:rPr>
+        <w:b/>
+        <w:color w:val="C9211E"/>
+        <w:sz w:val="24"/>
+        <w:szCs w:val="24"/>
+        <w:u w:val="none"/>
+      </w:rPr>
+      <w:t>Email: [user-email]</w:t>
+    </w:r>
+  </w:p>
+</w:hdr>
+</file>
+
+<file path=word/header3.xml><?xml version="1.0" encoding="utf-8"?>
+<w:hdr xmlns:o="urn:schemas-microsoft-com:office:office" xmlns:r="http://schemas.openxmlformats.org/officeDocument/2006/relationships" xmlns:v="urn:schemas-microsoft-com:vml" xmlns:w="http://schemas.openxmlformats.org/wordprocessingml/2006/main" xmlns:w10="urn:schemas-microsoft-com:office:word" xmlns:wp="http://schemas.openxmlformats.org/drawingml/2006/wordprocessingDrawing" xmlns:wps="http://schemas.microsoft.com/office/word/2010/wordprocessingShape" xmlns:wpg="http://schemas.microsoft.com/office/word/2010/wordprocessingGroup" xmlns:mc="http://schemas.openxmlformats.org/markup-compatibility/2006" xmlns:wp14="http://schemas.microsoft.com/office/word/2010/wordprocessingDrawing" xmlns:w14="http://schemas.microsoft.com/office/word/2010/wordml" xmlns:w15="http://schemas.microsoft.com/office/word/2012/wordml" mc:Ignorable="w14 wp14 w15">
+  <w:p>
+    <w:pPr>
+      <w:pStyle w:val="Normal"/>
+      <w:bidi w:val="0"/>
+      <w:ind w:hanging="0" w:start="-284"/>
+      <w:jc w:val="end"/>
+      <w:rPr>
+        <w:color w:val="000000"/>
+      </w:rPr>
+    </w:pPr>
+    <w:r>
+      <w:rPr>
+        <w:b/>
+        <w:color w:val="000000"/>
+        <w:sz w:val="24"/>
+        <w:szCs w:val="24"/>
+        <w:u w:val="single"/>
+      </w:rPr>
+      <w:t>PI: Matthew Larkum</w:t>
+    </w:r>
+  </w:p>
+  <w:p>
+    <w:pPr>
+      <w:pStyle w:val="Normal"/>
+      <w:bidi w:val="0"/>
+      <w:ind w:hanging="0" w:start="-284"/>
+      <w:jc w:val="end"/>
+      <w:rPr>
+        <w:color w:val="000000"/>
+      </w:rPr>
+    </w:pPr>
+    <w:r>
+      <w:rPr>
+        <w:b/>
+        <w:color w:val="C9211E"/>
+        <w:sz w:val="24"/>
+        <w:szCs w:val="24"/>
+        <w:u w:val="none"/>
+      </w:rPr>
+      <w:t>Individual responsible: [user]</w:t>
+    </w:r>
+  </w:p>
+  <w:p>
+    <w:pPr>
+      <w:pStyle w:val="Normal"/>
+      <w:bidi w:val="0"/>
+      <w:ind w:hanging="0" w:start="-284"/>
       <w:jc w:val="end"/>
       <w:rPr>
         <w:color w:val="000000"/>
@@ -2178,7 +2300,7 @@
   <w:style w:type="paragraph" w:styleId="Heading">
     <w:name w:val="Heading"/>
     <w:basedOn w:val="Normal"/>
-    <w:next w:val="TextBody"/>
+    <w:next w:val="BodyText"/>
     <w:qFormat/>
     <w:pPr>
       <w:keepNext w:val="true"/>
@@ -2190,7 +2312,7 @@
       <w:szCs w:val="28"/>
     </w:rPr>
   </w:style>
-  <w:style w:type="paragraph" w:styleId="TextBody">
+  <w:style w:type="paragraph" w:styleId="BodyText">
     <w:name w:val="Body Text"/>
     <w:basedOn w:val="Normal"/>
     <w:pPr>
@@ -2200,7 +2322,7 @@
   </w:style>
   <w:style w:type="paragraph" w:styleId="List">
     <w:name w:val="List"/>
-    <w:basedOn w:val="TextBody"/>
+    <w:basedOn w:val="BodyText"/>
     <w:pPr/>
     <w:rPr>
       <w:rFonts w:cs="Droid Sans Devanagari"/>
@@ -2239,7 +2361,7 @@
     <w:basedOn w:val="Normal"/>
     <w:qFormat/>
     <w:pPr>
-      <w:ind w:start="720" w:hanging="0"/>
+      <w:ind w:hanging="0" w:start="720"/>
     </w:pPr>
     <w:rPr/>
   </w:style>
@@ -2297,4 +2419,110 @@
     </w:rPr>
   </w:style>
 </w:styles>
+</file>
+
+<file path=word/theme/theme1.xml><?xml version="1.0" encoding="utf-8"?>
+<a:theme xmlns:a="http://schemas.openxmlformats.org/drawingml/2006/main" xmlns:r="http://schemas.openxmlformats.org/officeDocument/2006/relationships" name="Office">
+  <a:themeElements>
+    <a:clrScheme name="LibreOffice">
+      <a:dk1>
+        <a:srgbClr val="000000"/>
+      </a:dk1>
+      <a:lt1>
+        <a:srgbClr val="ffffff"/>
+      </a:lt1>
+      <a:dk2>
+        <a:srgbClr val="000000"/>
+      </a:dk2>
+      <a:lt2>
+        <a:srgbClr val="ffffff"/>
+      </a:lt2>
+      <a:accent1>
+        <a:srgbClr val="18a303"/>
+      </a:accent1>
+      <a:accent2>
+        <a:srgbClr val="0369a3"/>
+      </a:accent2>
+      <a:accent3>
+        <a:srgbClr val="a33e03"/>
+      </a:accent3>
+      <a:accent4>
+        <a:srgbClr val="8e03a3"/>
+      </a:accent4>
+      <a:accent5>
+        <a:srgbClr val="c99c00"/>
+      </a:accent5>
+      <a:accent6>
+        <a:srgbClr val="c9211e"/>
+      </a:accent6>
+      <a:hlink>
+        <a:srgbClr val="0000ee"/>
+      </a:hlink>
+      <a:folHlink>
+        <a:srgbClr val="551a8b"/>
+      </a:folHlink>
+    </a:clrScheme>
+    <a:fontScheme name="Office">
+      <a:majorFont>
+        <a:latin typeface="Arial" pitchFamily="0" charset="1"/>
+        <a:ea typeface="DejaVu Sans" pitchFamily="0" charset="1"/>
+        <a:cs typeface="DejaVu Sans" pitchFamily="0" charset="1"/>
+      </a:majorFont>
+      <a:minorFont>
+        <a:latin typeface="Arial" pitchFamily="0" charset="1"/>
+        <a:ea typeface="DejaVu Sans" pitchFamily="0" charset="1"/>
+        <a:cs typeface="DejaVu Sans" pitchFamily="0" charset="1"/>
+      </a:minorFont>
+    </a:fontScheme>
+    <a:fmtScheme>
+      <a:fillStyleLst>
+        <a:solidFill>
+          <a:schemeClr val="phClr"/>
+        </a:solidFill>
+        <a:solidFill>
+          <a:schemeClr val="phClr"/>
+        </a:solidFill>
+        <a:solidFill>
+          <a:schemeClr val="phClr"/>
+        </a:solidFill>
+      </a:fillStyleLst>
+      <a:lnStyleLst>
+        <a:ln w="6350" cap="flat" cmpd="sng" algn="ctr">
+          <a:prstDash val="solid"/>
+          <a:miter/>
+        </a:ln>
+        <a:ln w="6350" cap="flat" cmpd="sng" algn="ctr">
+          <a:prstDash val="solid"/>
+          <a:miter/>
+        </a:ln>
+        <a:ln w="6350" cap="flat" cmpd="sng" algn="ctr">
+          <a:prstDash val="solid"/>
+          <a:miter/>
+        </a:ln>
+      </a:lnStyleLst>
+      <a:effectStyleLst>
+        <a:effectStyle>
+          <a:effectLst/>
+        </a:effectStyle>
+        <a:effectStyle>
+          <a:effectLst/>
+        </a:effectStyle>
+        <a:effectStyle>
+          <a:effectLst/>
+        </a:effectStyle>
+      </a:effectStyleLst>
+      <a:bgFillStyleLst>
+        <a:solidFill>
+          <a:schemeClr val="phClr"/>
+        </a:solidFill>
+        <a:solidFill>
+          <a:schemeClr val="phClr"/>
+        </a:solidFill>
+        <a:solidFill>
+          <a:schemeClr val="phClr"/>
+        </a:solidFill>
+      </a:bgFillStyleLst>
+    </a:fmtScheme>
+  </a:themeElements>
+</a:theme>
 </file>
</xml_diff>

<commit_message>
Fixes #274 - alows adding comment to surgery sheet
</commit_message>
<xml_diff>
--- a/templates/surgery_sheet/default.docx
+++ b/templates/surgery_sheet/default.docx
@@ -737,8 +737,8 @@
       <w:tblGrid>
         <w:gridCol w:w="1892"/>
         <w:gridCol w:w="1893"/>
-        <w:gridCol w:w="1443"/>
-        <w:gridCol w:w="2611"/>
+        <w:gridCol w:w="1442"/>
+        <w:gridCol w:w="2612"/>
         <w:gridCol w:w="1625"/>
       </w:tblGrid>
       <w:tr>
@@ -807,7 +807,7 @@
         </w:tc>
         <w:tc>
           <w:tcPr>
-            <w:tcW w:w="1443" w:type="dxa"/>
+            <w:tcW w:w="1442" w:type="dxa"/>
             <w:tcBorders>
               <w:top w:val="single" w:sz="4" w:space="0" w:color="000000"/>
               <w:start w:val="single" w:sz="4" w:space="0" w:color="000000"/>
@@ -839,7 +839,7 @@
         </w:tc>
         <w:tc>
           <w:tcPr>
-            <w:tcW w:w="2611" w:type="dxa"/>
+            <w:tcW w:w="2612" w:type="dxa"/>
             <w:tcBorders>
               <w:top w:val="single" w:sz="4" w:space="0" w:color="000000"/>
               <w:start w:val="single" w:sz="4" w:space="0" w:color="000000"/>
@@ -1852,6 +1852,7 @@
         <w:rPr>
           <w:color w:val="000000"/>
         </w:rPr>
+        <w:t>[notes]</w:t>
       </w:r>
     </w:p>
     <w:p>

</xml_diff>